<commit_message>
Update layout formatting for image elements and replace GNS3 with PNETLab
</commit_message>
<xml_diff>
--- a/AlanGarcia_2025-1403_Segundo_Parcial.docx
+++ b/AlanGarcia_2025-1403_Segundo_Parcial.docx
@@ -1363,11 +1363,6 @@
     </w:tbl>
     <w:p>
       <w:pPr>
-        <w:pStyle w:val="BodyText"/>
-      </w:pPr>
-    </w:p>
-    <w:p>
-      <w:pPr>
         <w:pStyle w:val="CaptionedFigure"/>
         <w:keepNext/>
         <w:keepLines/>
@@ -1377,12 +1372,12 @@
           <wp:inline>
             <wp:extent cx="5334000" cy="3099345"/>
             <wp:effectExtent b="0" l="0" r="0" t="0"/>
-            <wp:docPr descr="Topologia de Red GNS3" title="" id="11" name="Picture"/>
+            <wp:docPr descr="Topologia de Red PNETLab" title="" id="11" name="Picture"/>
             <ns2:graphic>
               <ns2:graphicData uri="http://schemas.openxmlformats.org/drawingml/2006/picture">
                 <ns3:pic>
                   <ns3:nvPicPr>
-                    <ns3:cNvPr descr="images/02_topologia_gns3.png" id="12" name="Picture"/>
+                    <ns3:cNvPr descr="images/02_topologia_pnetlab.png" id="12" name="Picture"/>
                     <ns3:cNvPicPr>
                       <ns2:picLocks noChangeArrowheads="1" noChangeAspect="1"/>
                     </ns3:cNvPicPr>
@@ -1420,7 +1415,7 @@
         <w:pStyle w:val="ImageCaption"/>
       </w:pPr>
       <w:r>
-        <w:t xml:space="preserve">Topologia de Red GNS3</w:t>
+        <w:t xml:space="preserve">Topologia de Red PNETLab</w:t>
       </w:r>
     </w:p>
     <w:p>
@@ -1428,15 +1423,11 @@
         <w:pStyle w:val="BodyText"/>
       </w:pPr>
       <w:r>
-        <w:rPr>
-          <w:i/>
-          <w:iCs/>
-        </w:rPr>
-        <w:t xml:space="preserve">Figura 1: Topología lógica del escenario implementada en GNS3.</w:t>
+        <w:t xml:space="preserve">Figura 1: Topología lógica del escenario implementada en PNETLab.</w:t>
       </w:r>
     </w:p>
     <w:bookmarkEnd w:id="13"/>
-    <w:bookmarkStart w:id="25" w:name="configuración-de-windows-server"/>
+    <w:bookmarkStart w:id="18" w:name="configuración-de-windows-server"/>
     <w:p>
       <w:pPr>
         <w:pStyle w:val="Heading2"/>
@@ -1692,15 +1683,16 @@
       </w:r>
     </w:p>
     <w:bookmarkEnd w:id="17"/>
-    <w:bookmarkStart w:id="24" w:name="network-policy-server-nps-y-aaa-radius"/>
-    <w:p>
-      <w:pPr>
-        <w:pStyle w:val="Heading3"/>
+    <w:bookmarkEnd w:id="18"/>
+    <w:bookmarkStart w:id="23" w:name="X2c3b685f59dfbcf278e5fb345c3177493ad1345"/>
+    <w:p>
+      <w:pPr>
+        <w:pStyle w:val="Heading2"/>
         <w:keepNext/>
         <w:keepLines/>
       </w:pPr>
       <w:r>
-        <w:t xml:space="preserve">3.3 Network Policy Server (NPS) y AAA RADIUS</w:t>
+        <w:t xml:space="preserve">4. Configuración de Dispositivos Cisco (Cisco IOS)</w:t>
       </w:r>
     </w:p>
     <w:p>
@@ -1708,7 +1700,7 @@
         <w:pStyle w:val="FirstParagraph"/>
       </w:pPr>
       <w:r>
-        <w:t xml:space="preserve">El servicio NPS gestiona las solicitudes de acceso SSH provenientes de los routers. El flujo de configuración requiere:</w:t>
+        <w:t xml:space="preserve">Todos los comandos y configuraciones completas aplicados a los routers se encuentran estructurados y comentados de forma organizada en los siguientes recursos del repositorio:</w:t>
       </w:r>
     </w:p>
     <w:p>
@@ -1720,443 +1712,12 @@
         </w:numPr>
       </w:pPr>
       <w:r>
-        <w:rPr>
-          <w:b/>
-          <w:bCs/>
-        </w:rPr>
-        <w:t xml:space="preserve">Clientes RADIUS:</w:t>
-      </w:r>
-      <w:r>
-        <w:t xml:space="preserve"> </w:t>
-      </w:r>
-      <w:r>
-        <w:t xml:space="preserve">Se registran los routers</w:t>
-      </w:r>
-      <w:r>
-        <w:t xml:space="preserve"> </w:t>
-      </w:r>
-      <w:r>
-        <w:rPr>
-          <w:rStyle w:val="VerbatimChar"/>
-        </w:rPr>
-        <w:t xml:space="preserve">R-Oeste</w:t>
-      </w:r>
-      <w:r>
-        <w:t xml:space="preserve"> </w:t>
-      </w:r>
-      <w:r>
-        <w:t xml:space="preserve">(identificado en la red interna con su IP origen de túnel</w:t>
-      </w:r>
-      <w:r>
-        <w:t xml:space="preserve"> </w:t>
-      </w:r>
-      <w:r>
-        <w:rPr>
-          <w:rStyle w:val="VerbatimChar"/>
-        </w:rPr>
-        <w:t xml:space="preserve">10.0.0.1</w:t>
-      </w:r>
-      <w:r>
-        <w:t xml:space="preserve">) y</w:t>
-      </w:r>
-      <w:r>
-        <w:t xml:space="preserve"> </w:t>
-      </w:r>
-      <w:r>
-        <w:rPr>
-          <w:rStyle w:val="VerbatimChar"/>
-        </w:rPr>
-        <w:t xml:space="preserve">R-Este</w:t>
-      </w:r>
-      <w:r>
-        <w:t xml:space="preserve"> </w:t>
-      </w:r>
-      <w:r>
-        <w:t xml:space="preserve">(</w:t>
-      </w:r>
-      <w:r>
-        <w:rPr>
-          <w:rStyle w:val="VerbatimChar"/>
-        </w:rPr>
-        <w:t xml:space="preserve">14.3.20.1</w:t>
-      </w:r>
-      <w:r>
-        <w:t xml:space="preserve">) como clientes RADIUS de confianza. Se establece la clave secreta compartida:</w:t>
-      </w:r>
-      <w:r>
-        <w:t xml:space="preserve"> </w:t>
-      </w:r>
-      <w:r>
-        <w:rPr>
-          <w:rStyle w:val="VerbatimChar"/>
-        </w:rPr>
-        <w:t xml:space="preserve">20251403</w:t>
-      </w:r>
-      <w:r>
-        <w:t xml:space="preserve">.</w:t>
-      </w:r>
-      <w:r>
-        <w:t xml:space="preserve"> </w:t>
-      </w:r>
-    </w:p>
-    <w:p>
-      <w:pPr>
-        <w:pStyle w:val="CaptionedFigure"/>
-        <w:keepNext/>
-        <w:keepLines/>
-      </w:pPr>
-      <w:r>
-        <w:drawing>
-          <wp:inline>
-            <wp:extent cx="5334000" cy="1757484"/>
-            <wp:effectExtent b="0" l="0" r="0" t="0"/>
-            <wp:docPr descr="RADIUS Clients en NPS" title="" id="19" name="Picture"/>
-            <ns2:graphic>
-              <ns2:graphicData uri="http://schemas.openxmlformats.org/drawingml/2006/picture">
-                <ns3:pic>
-                  <ns3:nvPicPr>
-                    <ns3:cNvPr descr="images/08_nps_radius_clients.png" id="20" name="Picture"/>
-                    <ns3:cNvPicPr>
-                      <ns2:picLocks noChangeArrowheads="1" noChangeAspect="1"/>
-                    </ns3:cNvPicPr>
-                  </ns3:nvPicPr>
-                  <ns3:blipFill>
-                    <ns2:blip r:embed="rId18"/>
-                    <ns2:stretch>
-                      <ns2:fillRect/>
-                    </ns2:stretch>
-                  </ns3:blipFill>
-                  <ns3:spPr bwMode="auto">
-                    <ns2:xfrm>
-                      <ns2:off x="0" y="0"/>
-                      <ns2:ext cx="5334000" cy="1757484"/>
-                    </ns2:xfrm>
-                    <ns2:prstGeom prst="rect">
-                      <ns2:avLst/>
-                    </ns2:prstGeom>
-                    <ns2:noFill/>
-                    <ns2:ln w="9525">
-                      <ns2:noFill/>
-                      <ns2:headEnd/>
-                      <ns2:tailEnd/>
-                    </ns2:ln>
-                  </ns3:spPr>
-                </ns3:pic>
-              </ns2:graphicData>
-            </ns2:graphic>
-          </wp:inline>
-        </w:drawing>
-      </w:r>
-    </w:p>
-    <w:p>
-      <w:pPr>
-        <w:pStyle w:val="ImageCaption"/>
-      </w:pPr>
-      <w:r>
-        <w:t xml:space="preserve">RADIUS Clients en NPS</w:t>
-      </w:r>
-    </w:p>
-    <w:p>
-      <w:pPr>
-        <w:pStyle w:val="BodyText"/>
-      </w:pPr>
-      <w:r>
-        <w:rPr>
-          <w:i/>
-          <w:iCs/>
-        </w:rPr>
-        <w:t xml:space="preserve">Figura 4: Clientes RADIUS registrados en el NPS para R-Oeste (10.0.0.1) y R-Este (14.3.20.1).</w:t>
-      </w:r>
-    </w:p>
-    <w:p>
-      <w:pPr>
-        <w:pStyle w:val="Compact"/>
-        <w:numPr>
-          <w:ilvl w:val="0"/>
-          <w:numId w:val="1005"/>
-        </w:numPr>
-      </w:pPr>
-      <w:r>
-        <w:rPr>
-          <w:b/>
-          <w:bCs/>
-        </w:rPr>
-        <w:t xml:space="preserve">Políticas de Red (Network Policies):</w:t>
-      </w:r>
-      <w:r>
-        <w:t xml:space="preserve"> </w:t>
-      </w:r>
-      <w:r>
-        <w:t xml:space="preserve">Se configuran tres políticas de acceso independientes con el siguiente orden de evaluación y condiciones:</w:t>
-      </w:r>
-    </w:p>
-    <w:p>
-      <w:pPr>
-        <w:pStyle w:val="Compact"/>
-        <w:numPr>
-          <w:ilvl w:val="1"/>
-          <w:numId w:val="1006"/>
-        </w:numPr>
-      </w:pPr>
-      <w:r>
-        <w:rPr>
-          <w:b/>
-          <w:bCs/>
-        </w:rPr>
-        <w:t xml:space="preserve">Cisco SSH Level 1 (Prioridad 1):</w:t>
-      </w:r>
-      <w:r>
-        <w:t xml:space="preserve"> </w:t>
-      </w:r>
-      <w:r>
-        <w:t xml:space="preserve">Evalúa la membresía en el grupo</w:t>
-      </w:r>
-      <w:r>
-        <w:t xml:space="preserve"> </w:t>
-      </w:r>
-      <w:r>
-        <w:rPr>
-          <w:rStyle w:val="VerbatimChar"/>
-        </w:rPr>
-        <w:t xml:space="preserve">ALAN\NPS1</w:t>
-      </w:r>
-      <w:r>
-        <w:t xml:space="preserve">. En los atributos de respuesta del RADIUS (pestaña Settings -&gt; Vendor Specific Attributes) se inyecta el Vendor Code</w:t>
-      </w:r>
-      <w:r>
-        <w:t xml:space="preserve"> </w:t>
-      </w:r>
-      <w:r>
-        <w:rPr>
-          <w:rStyle w:val="VerbatimChar"/>
-        </w:rPr>
-        <w:t xml:space="preserve">9</w:t>
-      </w:r>
-      <w:r>
-        <w:t xml:space="preserve"> </w:t>
-      </w:r>
-      <w:r>
-        <w:t xml:space="preserve">(Cisco) con el VSA</w:t>
-      </w:r>
-      <w:r>
-        <w:t xml:space="preserve"> </w:t>
-      </w:r>
-      <w:r>
-        <w:rPr>
-          <w:rStyle w:val="VerbatimChar"/>
-          <w:b/>
-          <w:bCs/>
-        </w:rPr>
-        <w:t xml:space="preserve">shell:priv-lvl=1</w:t>
-      </w:r>
-      <w:r>
-        <w:t xml:space="preserve">.</w:t>
-      </w:r>
-    </w:p>
-    <w:p>
-      <w:pPr>
-        <w:pStyle w:val="Compact"/>
-        <w:numPr>
-          <w:ilvl w:val="1"/>
-          <w:numId w:val="1006"/>
-        </w:numPr>
-      </w:pPr>
-      <w:r>
-        <w:rPr>
-          <w:b/>
-          <w:bCs/>
-        </w:rPr>
-        <w:t xml:space="preserve">Cisco SSH Level 10 (Prioridad 2):</w:t>
-      </w:r>
-      <w:r>
-        <w:t xml:space="preserve"> </w:t>
-      </w:r>
-      <w:r>
-        <w:t xml:space="preserve">Evalúa la membresía en el grupo</w:t>
-      </w:r>
-      <w:r>
-        <w:t xml:space="preserve"> </w:t>
-      </w:r>
-      <w:r>
-        <w:rPr>
-          <w:rStyle w:val="VerbatimChar"/>
-        </w:rPr>
-        <w:t xml:space="preserve">ALAN\NPS10</w:t>
-      </w:r>
-      <w:r>
-        <w:t xml:space="preserve">. Inyecta el atributo Cisco-AV-Pair</w:t>
-      </w:r>
-      <w:r>
-        <w:t xml:space="preserve"> </w:t>
-      </w:r>
-      <w:r>
-        <w:rPr>
-          <w:rStyle w:val="VerbatimChar"/>
-          <w:b/>
-          <w:bCs/>
-        </w:rPr>
-        <w:t xml:space="preserve">shell:priv-lvl=10</w:t>
-      </w:r>
-      <w:r>
-        <w:t xml:space="preserve">.</w:t>
-      </w:r>
-    </w:p>
-    <w:p>
-      <w:pPr>
-        <w:pStyle w:val="Compact"/>
-        <w:numPr>
-          <w:ilvl w:val="1"/>
-          <w:numId w:val="1006"/>
-        </w:numPr>
-      </w:pPr>
-      <w:r>
-        <w:rPr>
-          <w:b/>
-          <w:bCs/>
-        </w:rPr>
-        <w:t xml:space="preserve">Cisco SSH Level 15 (Prioridad 3):</w:t>
-      </w:r>
-      <w:r>
-        <w:t xml:space="preserve"> </w:t>
-      </w:r>
-      <w:r>
-        <w:t xml:space="preserve">Evalúa la membresía en el grupo</w:t>
-      </w:r>
-      <w:r>
-        <w:t xml:space="preserve"> </w:t>
-      </w:r>
-      <w:r>
-        <w:rPr>
-          <w:rStyle w:val="VerbatimChar"/>
-        </w:rPr>
-        <w:t xml:space="preserve">ALAN\NPS15</w:t>
-      </w:r>
-      <w:r>
-        <w:t xml:space="preserve">. Inyecta el atributo Cisco-AV-Pair</w:t>
-      </w:r>
-      <w:r>
-        <w:t xml:space="preserve"> </w:t>
-      </w:r>
-      <w:r>
-        <w:rPr>
-          <w:rStyle w:val="VerbatimChar"/>
-          <w:b/>
-          <w:bCs/>
-        </w:rPr>
-        <w:t xml:space="preserve">shell:priv-lvl=15</w:t>
-      </w:r>
-      <w:r>
-        <w:t xml:space="preserve">.</w:t>
-      </w:r>
-      <w:r>
-        <w:t xml:space="preserve"> </w:t>
-      </w:r>
-    </w:p>
-    <w:p>
-      <w:pPr>
-        <w:pStyle w:val="CaptionedFigure"/>
-        <w:keepNext/>
-        <w:keepLines/>
-      </w:pPr>
-      <w:r>
-        <w:drawing>
-          <wp:inline>
-            <wp:extent cx="5334000" cy="1793915"/>
-            <wp:effectExtent b="0" l="0" r="0" t="0"/>
-            <wp:docPr descr="Network Policies en NPS" title="" id="22" name="Picture"/>
-            <ns2:graphic>
-              <ns2:graphicData uri="http://schemas.openxmlformats.org/drawingml/2006/picture">
-                <ns3:pic>
-                  <ns3:nvPicPr>
-                    <ns3:cNvPr descr="images/07_nps_network_policies.png" id="23" name="Picture"/>
-                    <ns3:cNvPicPr>
-                      <ns2:picLocks noChangeArrowheads="1" noChangeAspect="1"/>
-                    </ns3:cNvPicPr>
-                  </ns3:nvPicPr>
-                  <ns3:blipFill>
-                    <ns2:blip r:embed="rId21"/>
-                    <ns2:stretch>
-                      <ns2:fillRect/>
-                    </ns2:stretch>
-                  </ns3:blipFill>
-                  <ns3:spPr bwMode="auto">
-                    <ns2:xfrm>
-                      <ns2:off x="0" y="0"/>
-                      <ns2:ext cx="5334000" cy="1793915"/>
-                    </ns2:xfrm>
-                    <ns2:prstGeom prst="rect">
-                      <ns2:avLst/>
-                    </ns2:prstGeom>
-                    <ns2:noFill/>
-                    <ns2:ln w="9525">
-                      <ns2:noFill/>
-                      <ns2:headEnd/>
-                      <ns2:tailEnd/>
-                    </ns2:ln>
-                  </ns3:spPr>
-                </ns3:pic>
-              </ns2:graphicData>
-            </ns2:graphic>
-          </wp:inline>
-        </w:drawing>
-      </w:r>
-    </w:p>
-    <w:p>
-      <w:pPr>
-        <w:pStyle w:val="ImageCaption"/>
-      </w:pPr>
-      <w:r>
-        <w:t xml:space="preserve">Network Policies en NPS</w:t>
-      </w:r>
-    </w:p>
-    <w:p>
-      <w:pPr>
-        <w:pStyle w:val="BodyText"/>
-      </w:pPr>
-      <w:r>
-        <w:rPr>
-          <w:i/>
-          <w:iCs/>
-        </w:rPr>
-        <w:t xml:space="preserve">Figura 5: Directivas de red (Network Policies) estructuradas en el NPS según el nivel de privilegio.</w:t>
-      </w:r>
-    </w:p>
-    <w:bookmarkEnd w:id="24"/>
-    <w:bookmarkEnd w:id="25"/>
-    <w:bookmarkStart w:id="30" w:name="X2c3b685f59dfbcf278e5fb345c3177493ad1345"/>
-    <w:p>
-      <w:pPr>
-        <w:pStyle w:val="Heading2"/>
-        <w:keepNext/>
-        <w:keepLines/>
-      </w:pPr>
-      <w:r>
-        <w:t xml:space="preserve">4. Configuración de Dispositivos Cisco (Cisco IOS)</w:t>
-      </w:r>
-    </w:p>
-    <w:p>
-      <w:pPr>
-        <w:pStyle w:val="FirstParagraph"/>
-      </w:pPr>
-      <w:r>
-        <w:t xml:space="preserve">Todos los comandos y configuraciones completas aplicados a los routers se encuentran estructurados y comentados de forma organizada en los siguientes recursos del repositorio:</w:t>
-      </w:r>
-    </w:p>
-    <w:p>
-      <w:pPr>
-        <w:pStyle w:val="Compact"/>
-        <w:numPr>
-          <w:ilvl w:val="0"/>
-          <w:numId w:val="1007"/>
-        </w:numPr>
-      </w:pPr>
-      <w:r>
         <w:t xml:space="preserve">Script de Configuración del Router Oeste:</w:t>
       </w:r>
       <w:r>
         <w:t xml:space="preserve"> </w:t>
       </w:r>
-      <w:hyperlink r:id="rId26">
+      <w:hyperlink r:id="rId19">
         <w:r>
           <w:rPr>
             <w:rStyle w:val="Hyperlink"/>
@@ -2173,7 +1734,7 @@
         <w:pStyle w:val="Compact"/>
         <w:numPr>
           <w:ilvl w:val="0"/>
-          <w:numId w:val="1007"/>
+          <w:numId w:val="1004"/>
         </w:numPr>
       </w:pPr>
       <w:r>
@@ -2182,7 +1743,7 @@
       <w:r>
         <w:t xml:space="preserve"> </w:t>
       </w:r>
-      <w:hyperlink r:id="rId27">
+      <w:hyperlink r:id="rId20">
         <w:r>
           <w:rPr>
             <w:rStyle w:val="Hyperlink"/>
@@ -2199,7 +1760,7 @@
         <w:pStyle w:val="Compact"/>
         <w:numPr>
           <w:ilvl w:val="0"/>
-          <w:numId w:val="1007"/>
+          <w:numId w:val="1004"/>
         </w:numPr>
       </w:pPr>
       <w:r>
@@ -2208,7 +1769,7 @@
       <w:r>
         <w:t xml:space="preserve"> </w:t>
       </w:r>
-      <w:hyperlink r:id="rId28">
+      <w:hyperlink r:id="rId21">
         <w:r>
           <w:rPr>
             <w:rStyle w:val="Hyperlink"/>
@@ -2220,7 +1781,7 @@
         <w:t xml:space="preserve">.</w:t>
       </w:r>
     </w:p>
-    <w:bookmarkStart w:id="29" w:name="X0834915414cc4d95cdc48ca7fbeb6c8b11e633d"/>
+    <w:bookmarkStart w:id="22" w:name="X0834915414cc4d95cdc48ca7fbeb6c8b11e633d"/>
     <w:p>
       <w:pPr>
         <w:pStyle w:val="Heading3"/>
@@ -2244,7 +1805,7 @@
         <w:pStyle w:val="Compact"/>
         <w:numPr>
           <w:ilvl w:val="0"/>
-          <w:numId w:val="1008"/>
+          <w:numId w:val="1005"/>
         </w:numPr>
       </w:pPr>
       <w:r>
@@ -2296,7 +1857,7 @@
         <w:pStyle w:val="Compact"/>
         <w:numPr>
           <w:ilvl w:val="0"/>
-          <w:numId w:val="1008"/>
+          <w:numId w:val="1005"/>
         </w:numPr>
       </w:pPr>
       <w:r>
@@ -2318,7 +1879,7 @@
         <w:pStyle w:val="Compact"/>
         <w:numPr>
           <w:ilvl w:val="0"/>
-          <w:numId w:val="1008"/>
+          <w:numId w:val="1005"/>
         </w:numPr>
       </w:pPr>
       <w:r>
@@ -2374,9 +1935,9 @@
         <w:t xml:space="preserve">. El resto de tránsitos (ej. RDP puerto 3389, SMB puerto 445) provenientes de la LAN remota Oeste son denegados por completo.</w:t>
       </w:r>
     </w:p>
-    <w:bookmarkEnd w:id="29"/>
-    <w:bookmarkEnd w:id="30"/>
-    <w:bookmarkStart w:id="36" w:name="implementación-de-la-vpn-site-to-site"/>
+    <w:bookmarkEnd w:id="22"/>
+    <w:bookmarkEnd w:id="23"/>
+    <w:bookmarkStart w:id="29" w:name="implementación-de-la-vpn-site-to-site"/>
     <w:p>
       <w:pPr>
         <w:pStyle w:val="Heading2"/>
@@ -2395,7 +1956,7 @@
         <w:t xml:space="preserve">La interconexión segura entre la LAN Oeste y la LAN Este se realiza implementando un túnel GRE protegido por IPSec mediante políticas ISAKMP tradicionales en IKEv1:</w:t>
       </w:r>
     </w:p>
-    <w:bookmarkStart w:id="31" w:name="parámetros-isakmp-de-fase-1"/>
+    <w:bookmarkStart w:id="24" w:name="parámetros-isakmp-de-fase-1"/>
     <w:p>
       <w:pPr>
         <w:pStyle w:val="Heading3"/>
@@ -2419,7 +1980,7 @@
         <w:pStyle w:val="Compact"/>
         <w:numPr>
           <w:ilvl w:val="0"/>
-          <w:numId w:val="1009"/>
+          <w:numId w:val="1006"/>
         </w:numPr>
       </w:pPr>
       <w:r>
@@ -2441,7 +2002,7 @@
         <w:pStyle w:val="Compact"/>
         <w:numPr>
           <w:ilvl w:val="0"/>
-          <w:numId w:val="1009"/>
+          <w:numId w:val="1006"/>
         </w:numPr>
       </w:pPr>
       <w:r>
@@ -2463,7 +2024,7 @@
         <w:pStyle w:val="Compact"/>
         <w:numPr>
           <w:ilvl w:val="0"/>
-          <w:numId w:val="1009"/>
+          <w:numId w:val="1006"/>
         </w:numPr>
       </w:pPr>
       <w:r>
@@ -2485,7 +2046,7 @@
         <w:pStyle w:val="Compact"/>
         <w:numPr>
           <w:ilvl w:val="0"/>
-          <w:numId w:val="1009"/>
+          <w:numId w:val="1006"/>
         </w:numPr>
       </w:pPr>
       <w:r>
@@ -2507,7 +2068,7 @@
         <w:pStyle w:val="Compact"/>
         <w:numPr>
           <w:ilvl w:val="0"/>
-          <w:numId w:val="1009"/>
+          <w:numId w:val="1006"/>
         </w:numPr>
       </w:pPr>
       <w:r>
@@ -2536,8 +2097,8 @@
         <w:t xml:space="preserve">.</w:t>
       </w:r>
     </w:p>
-    <w:bookmarkEnd w:id="31"/>
-    <w:bookmarkStart w:id="35" w:name="parámetros-ipsec-de-fase-2"/>
+    <w:bookmarkEnd w:id="24"/>
+    <w:bookmarkStart w:id="28" w:name="parámetros-ipsec-de-fase-2"/>
     <w:p>
       <w:pPr>
         <w:pStyle w:val="Heading3"/>
@@ -2632,11 +2193,6 @@
         </w:rPr>
         <w:t xml:space="preserve"> tunnel protection ipsec profile PROFILE_GRE</w:t>
       </w:r>
-    </w:p>
-    <w:p>
-      <w:pPr>
-        <w:pStyle w:val="FirstParagraph"/>
-      </w:pPr>
     </w:p>
     <w:p>
       <w:pPr>
@@ -2649,18 +2205,18 @@
           <wp:inline>
             <wp:extent cx="5334000" cy="1562400"/>
             <wp:effectExtent b="0" l="0" r="0" t="0"/>
-            <wp:docPr descr="Crypto Session Active" title="" id="33" name="Picture"/>
+            <wp:docPr descr="Crypto Session Active" title="" id="26" name="Picture"/>
             <ns2:graphic>
               <ns2:graphicData uri="http://schemas.openxmlformats.org/drawingml/2006/picture">
                 <ns3:pic>
                   <ns3:nvPicPr>
-                    <ns3:cNvPr descr="images/05_crypto_session_active.png" id="34" name="Picture"/>
+                    <ns3:cNvPr descr="images/05_crypto_session_active.png" id="27" name="Picture"/>
                     <ns3:cNvPicPr>
                       <ns2:picLocks noChangeArrowheads="1" noChangeAspect="1"/>
                     </ns3:cNvPicPr>
                   </ns3:nvPicPr>
                   <ns3:blipFill>
-                    <ns2:blip r:embed="rId32"/>
+                    <ns2:blip r:embed="rId25"/>
                     <ns2:stretch>
                       <ns2:fillRect/>
                     </ns2:stretch>
@@ -2700,16 +2256,12 @@
         <w:pStyle w:val="BodyText"/>
       </w:pPr>
       <w:r>
-        <w:rPr>
-          <w:i/>
-          <w:iCs/>
-        </w:rPr>
         <w:t xml:space="preserve">Figura 6: Verificación del estado activo (ACTIVE) del túnel VPN IKEv1 (ISAKMP) en R-Oeste.</w:t>
       </w:r>
     </w:p>
-    <w:bookmarkEnd w:id="35"/>
-    <w:bookmarkEnd w:id="36"/>
-    <w:bookmarkStart w:id="40" w:name="Xc0b4b065515739d96369c9eb0cbe92e6b310c73"/>
+    <w:bookmarkEnd w:id="28"/>
+    <w:bookmarkEnd w:id="29"/>
+    <w:bookmarkStart w:id="33" w:name="Xc0b4b065515739d96369c9eb0cbe92e6b310c73"/>
     <w:p>
       <w:pPr>
         <w:pStyle w:val="Heading2"/>
@@ -2733,7 +2285,7 @@
         <w:pStyle w:val="Compact"/>
         <w:numPr>
           <w:ilvl w:val="0"/>
-          <w:numId w:val="1010"/>
+          <w:numId w:val="1007"/>
         </w:numPr>
       </w:pPr>
       <w:r>
@@ -2800,7 +2352,7 @@
         <w:pStyle w:val="Compact"/>
         <w:numPr>
           <w:ilvl w:val="0"/>
-          <w:numId w:val="1010"/>
+          <w:numId w:val="1007"/>
         </w:numPr>
       </w:pPr>
       <w:r>
@@ -2870,18 +2422,18 @@
           <wp:inline>
             <wp:extent cx="5334000" cy="1821365"/>
             <wp:effectExtent b="0" l="0" r="0" t="0"/>
-            <wp:docPr descr="Tracert VPN" title="" id="38" name="Picture"/>
+            <wp:docPr descr="Tracert VPN" title="" id="31" name="Picture"/>
             <ns2:graphic>
               <ns2:graphicData uri="http://schemas.openxmlformats.org/drawingml/2006/picture">
                 <ns3:pic>
                   <ns3:nvPicPr>
-                    <ns3:cNvPr descr="images/03_tracert_vpn.png" id="39" name="Picture"/>
+                    <ns3:cNvPr descr="images/03_tracert_vpn.png" id="32" name="Picture"/>
                     <ns3:cNvPicPr>
                       <ns2:picLocks noChangeArrowheads="1" noChangeAspect="1"/>
                     </ns3:cNvPicPr>
                   </ns3:nvPicPr>
                   <ns3:blipFill>
-                    <ns2:blip r:embed="rId37"/>
+                    <ns2:blip r:embed="rId30"/>
                     <ns2:stretch>
                       <ns2:fillRect/>
                     </ns2:stretch>
@@ -2928,27 +2480,7 @@
         <w:t xml:space="preserve">Figura 7: Ejecución de tracert verificando que el tráfico LAN a LAN pasa a través del túnel VPN (10.0.0.2).</w:t>
       </w:r>
     </w:p>
-    <w:p>
-      <w:pPr>
-        <w:pStyle w:val="SourceCode"/>
-      </w:pPr>
-      <w:r>
-        <w:rPr>
-          <w:rStyle w:val="VerbatimChar"/>
-        </w:rPr>
-        <w:t xml:space="preserve">*   Iniciar sesión con el usuario de nivel 10 para comprobar que se asigna el nivel 10.</w:t>
-      </w:r>
-      <w:r>
-        <w:br/>
-      </w:r>
-      <w:r>
-        <w:rPr>
-          <w:rStyle w:val="VerbatimChar"/>
-        </w:rPr>
-        <w:t xml:space="preserve">*   Iniciar sesión con el usuario de nivel 1 para verificar que el nivel de acceso se restringe al mínimo.</w:t>
-      </w:r>
-    </w:p>
-    <w:bookmarkEnd w:id="40"/>
+    <w:bookmarkEnd w:id="33"/>
     <w:sectPr>
       <w:footnotePr>
         <w:numRestart w:val="eachSect"/>
@@ -3247,91 +2779,6 @@
       </w:pPr>
     </w:lvl>
   </w:abstractNum>
-  <w:abstractNum w:abstractNumId="99412">
-    <w:nsid w:val="00A99412"/>
-    <w:multiLevelType w:val="multilevel"/>
-    <w:lvl w:ilvl="0">
-      <w:start w:val="2"/>
-      <w:numFmt w:val="decimal"/>
-      <w:lvlText w:val="%1."/>
-      <w:lvlJc w:val="left"/>
-      <w:pPr>
-        <w:ind w:left="720" w:hanging="360"/>
-      </w:pPr>
-    </w:lvl>
-    <w:lvl w:ilvl="1">
-      <w:start w:val="2"/>
-      <w:numFmt w:val="decimal"/>
-      <w:lvlText w:val="%2."/>
-      <w:lvlJc w:val="left"/>
-      <w:pPr>
-        <w:ind w:left="1440" w:hanging="360"/>
-      </w:pPr>
-    </w:lvl>
-    <w:lvl w:ilvl="2">
-      <w:start w:val="2"/>
-      <w:numFmt w:val="decimal"/>
-      <w:lvlText w:val="%3."/>
-      <w:lvlJc w:val="left"/>
-      <w:pPr>
-        <w:ind w:left="2160" w:hanging="360"/>
-      </w:pPr>
-    </w:lvl>
-    <w:lvl w:ilvl="3">
-      <w:start w:val="2"/>
-      <w:numFmt w:val="decimal"/>
-      <w:lvlText w:val="%4."/>
-      <w:lvlJc w:val="left"/>
-      <w:pPr>
-        <w:ind w:left="2880" w:hanging="360"/>
-      </w:pPr>
-    </w:lvl>
-    <w:lvl w:ilvl="4">
-      <w:start w:val="2"/>
-      <w:numFmt w:val="decimal"/>
-      <w:lvlText w:val="%5."/>
-      <w:lvlJc w:val="left"/>
-      <w:pPr>
-        <w:ind w:left="3600" w:hanging="360"/>
-      </w:pPr>
-    </w:lvl>
-    <w:lvl w:ilvl="5">
-      <w:start w:val="2"/>
-      <w:numFmt w:val="decimal"/>
-      <w:lvlText w:val="%6."/>
-      <w:lvlJc w:val="left"/>
-      <w:pPr>
-        <w:ind w:left="4320" w:hanging="360"/>
-      </w:pPr>
-    </w:lvl>
-    <w:lvl w:ilvl="6">
-      <w:start w:val="2"/>
-      <w:numFmt w:val="decimal"/>
-      <w:lvlText w:val="%7."/>
-      <w:lvlJc w:val="left"/>
-      <w:pPr>
-        <w:ind w:left="5040" w:hanging="360"/>
-      </w:pPr>
-    </w:lvl>
-    <w:lvl w:ilvl="7">
-      <w:start w:val="2"/>
-      <w:numFmt w:val="decimal"/>
-      <w:lvlText w:val="%8."/>
-      <w:lvlJc w:val="left"/>
-      <w:pPr>
-        <w:ind w:left="5760" w:hanging="360"/>
-      </w:pPr>
-    </w:lvl>
-    <w:lvl w:ilvl="8">
-      <w:start w:val="2"/>
-      <w:numFmt w:val="decimal"/>
-      <w:lvlText w:val="%9."/>
-      <w:lvlJc w:val="left"/>
-      <w:pPr>
-        <w:ind w:left="6480" w:hanging="360"/>
-      </w:pPr>
-    </w:lvl>
-  </w:abstractNum>
   <w:num w:numId="1000">
     <w:abstractNumId w:val="990"/>
   </w:num>
@@ -3345,78 +2792,15 @@
     <w:abstractNumId w:val="991"/>
   </w:num>
   <w:num w:numId="1004">
-    <w:abstractNumId w:val="99411"/>
-    <w:lvlOverride w:ilvl="0">
-      <w:startOverride w:val="1"/>
-    </w:lvlOverride>
-    <w:lvlOverride w:ilvl="1">
-      <w:startOverride w:val="1"/>
-    </w:lvlOverride>
-    <w:lvlOverride w:ilvl="2">
-      <w:startOverride w:val="1"/>
-    </w:lvlOverride>
-    <w:lvlOverride w:ilvl="3">
-      <w:startOverride w:val="1"/>
-    </w:lvlOverride>
-    <w:lvlOverride w:ilvl="4">
-      <w:startOverride w:val="1"/>
-    </w:lvlOverride>
-    <w:lvlOverride w:ilvl="5">
-      <w:startOverride w:val="1"/>
-    </w:lvlOverride>
-    <w:lvlOverride w:ilvl="6">
-      <w:startOverride w:val="1"/>
-    </w:lvlOverride>
-    <w:lvlOverride w:ilvl="7">
-      <w:startOverride w:val="1"/>
-    </w:lvlOverride>
-    <w:lvlOverride w:ilvl="8">
-      <w:startOverride w:val="1"/>
-    </w:lvlOverride>
+    <w:abstractNumId w:val="991"/>
   </w:num>
   <w:num w:numId="1005">
-    <w:abstractNumId w:val="99412"/>
-    <w:lvlOverride w:ilvl="0">
-      <w:startOverride w:val="2"/>
-    </w:lvlOverride>
-    <w:lvlOverride w:ilvl="1">
-      <w:startOverride w:val="2"/>
-    </w:lvlOverride>
-    <w:lvlOverride w:ilvl="2">
-      <w:startOverride w:val="2"/>
-    </w:lvlOverride>
-    <w:lvlOverride w:ilvl="3">
-      <w:startOverride w:val="2"/>
-    </w:lvlOverride>
-    <w:lvlOverride w:ilvl="4">
-      <w:startOverride w:val="2"/>
-    </w:lvlOverride>
-    <w:lvlOverride w:ilvl="5">
-      <w:startOverride w:val="2"/>
-    </w:lvlOverride>
-    <w:lvlOverride w:ilvl="6">
-      <w:startOverride w:val="2"/>
-    </w:lvlOverride>
-    <w:lvlOverride w:ilvl="7">
-      <w:startOverride w:val="2"/>
-    </w:lvlOverride>
-    <w:lvlOverride w:ilvl="8">
-      <w:startOverride w:val="2"/>
-    </w:lvlOverride>
+    <w:abstractNumId w:val="991"/>
   </w:num>
   <w:num w:numId="1006">
     <w:abstractNumId w:val="991"/>
   </w:num>
   <w:num w:numId="1007">
-    <w:abstractNumId w:val="991"/>
-  </w:num>
-  <w:num w:numId="1008">
-    <w:abstractNumId w:val="991"/>
-  </w:num>
-  <w:num w:numId="1009">
-    <w:abstractNumId w:val="991"/>
-  </w:num>
-  <w:num w:numId="1010">
     <w:abstractNumId w:val="99411"/>
     <w:lvlOverride w:ilvl="0">
       <w:startOverride w:val="1"/>

</xml_diff>

<commit_message>
Fix unclosed div tags and clean image formatting
</commit_message>
<xml_diff>
--- a/AlanGarcia_2025-1403_Segundo_Parcial.docx
+++ b/AlanGarcia_2025-1403_Segundo_Parcial.docx
@@ -1427,7 +1427,7 @@
       </w:r>
     </w:p>
     <w:bookmarkEnd w:id="13"/>
-    <w:bookmarkStart w:id="18" w:name="configuración-de-windows-server"/>
+    <w:bookmarkStart w:id="30" w:name="configuración-de-windows-server"/>
     <w:p>
       <w:pPr>
         <w:pStyle w:val="Heading2"/>
@@ -1607,11 +1607,6 @@
       <w:r>
         <w:t xml:space="preserve">) para realizar las pruebas de autenticación.</w:t>
       </w:r>
-    </w:p>
-    <w:p>
-      <w:pPr>
-        <w:pStyle w:val="BodyText"/>
-      </w:pPr>
     </w:p>
     <w:p>
       <w:pPr>
@@ -1675,24 +1670,19 @@
         <w:pStyle w:val="BodyText"/>
       </w:pPr>
       <w:r>
-        <w:rPr>
-          <w:i/>
-          <w:iCs/>
-        </w:rPr>
         <w:t xml:space="preserve">Figura 2: Consola de Active Directory mostrando los grupos de seguridad y los usuarios creados para las directivas NPS.</w:t>
       </w:r>
     </w:p>
     <w:bookmarkEnd w:id="17"/>
-    <w:bookmarkEnd w:id="18"/>
-    <w:bookmarkStart w:id="23" w:name="X2c3b685f59dfbcf278e5fb345c3177493ad1345"/>
-    <w:p>
-      <w:pPr>
-        <w:pStyle w:val="Heading2"/>
+    <w:bookmarkStart w:id="22" w:name="internet-information-services-iis"/>
+    <w:p>
+      <w:pPr>
+        <w:pStyle w:val="Heading3"/>
         <w:keepNext/>
         <w:keepLines/>
       </w:pPr>
       <w:r>
-        <w:t xml:space="preserve">4. Configuración de Dispositivos Cisco (Cisco IOS)</w:t>
+        <w:t xml:space="preserve">3.2 Internet Information Services (IIS)</w:t>
       </w:r>
     </w:p>
     <w:p>
@@ -1700,7 +1690,133 @@
         <w:pStyle w:val="FirstParagraph"/>
       </w:pPr>
       <w:r>
-        <w:t xml:space="preserve">Todos los comandos y configuraciones completas aplicados a los routers se encuentran estructurados y comentados de forma organizada en los siguientes recursos del repositorio:</w:t>
+        <w:t xml:space="preserve">Se despliega el servidor web IIS en Windows Server. La intranet corporativa de V&amp;L Consultores Legales se aloja en el directorio predeterminado</w:t>
+      </w:r>
+      <w:r>
+        <w:t xml:space="preserve"> </w:t>
+      </w:r>
+      <w:r>
+        <w:rPr>
+          <w:rStyle w:val="VerbatimChar"/>
+        </w:rPr>
+        <w:t xml:space="preserve">C:\inetpub\wwwroot\index.html</w:t>
+      </w:r>
+      <w:r>
+        <w:t xml:space="preserve"> </w:t>
+      </w:r>
+      <w:r>
+        <w:t xml:space="preserve">utilizando el portal HTML premium diseñado. El archivo correspondiente está almacenado en el repositorio bajo:</w:t>
+      </w:r>
+      <w:r>
+        <w:t xml:space="preserve"> </w:t>
+      </w:r>
+      <w:hyperlink r:id="rId18">
+        <w:r>
+          <w:rPr>
+            <w:rStyle w:val="Hyperlink"/>
+          </w:rPr>
+          <w:t xml:space="preserve">index.html</w:t>
+        </w:r>
+      </w:hyperlink>
+      <w:r>
+        <w:t xml:space="preserve">.</w:t>
+      </w:r>
+    </w:p>
+    <w:p>
+      <w:pPr>
+        <w:pStyle w:val="CaptionedFigure"/>
+        <w:keepNext/>
+        <w:keepLines/>
+      </w:pPr>
+      <w:r>
+        <w:drawing>
+          <wp:inline>
+            <wp:extent cx="5334000" cy="4000500"/>
+            <wp:effectExtent b="0" l="0" r="0" t="0"/>
+            <wp:docPr descr="Intranet IIS" title="" id="20" name="Picture"/>
+            <ns2:graphic>
+              <ns2:graphicData uri="http://schemas.openxmlformats.org/drawingml/2006/picture">
+                <ns3:pic>
+                  <ns3:nvPicPr>
+                    <ns3:cNvPr descr="images/01_intranet_iis.png" id="21" name="Picture"/>
+                    <ns3:cNvPicPr>
+                      <ns2:picLocks noChangeArrowheads="1" noChangeAspect="1"/>
+                    </ns3:cNvPicPr>
+                  </ns3:nvPicPr>
+                  <ns3:blipFill>
+                    <ns2:blip r:embed="rId19"/>
+                    <ns2:stretch>
+                      <ns2:fillRect/>
+                    </ns2:stretch>
+                  </ns3:blipFill>
+                  <ns3:spPr bwMode="auto">
+                    <ns2:xfrm>
+                      <ns2:off x="0" y="0"/>
+                      <ns2:ext cx="5334000" cy="4000500"/>
+                    </ns2:xfrm>
+                    <ns2:prstGeom prst="rect">
+                      <ns2:avLst/>
+                    </ns2:prstGeom>
+                    <ns2:noFill/>
+                    <ns2:ln w="9525">
+                      <ns2:noFill/>
+                      <ns2:headEnd/>
+                      <ns2:tailEnd/>
+                    </ns2:ln>
+                  </ns3:spPr>
+                </ns3:pic>
+              </ns2:graphicData>
+            </ns2:graphic>
+          </wp:inline>
+        </w:drawing>
+      </w:r>
+    </w:p>
+    <w:p>
+      <w:pPr>
+        <w:pStyle w:val="ImageCaption"/>
+      </w:pPr>
+      <w:r>
+        <w:t xml:space="preserve">Intranet IIS</w:t>
+      </w:r>
+    </w:p>
+    <w:p>
+      <w:pPr>
+        <w:pStyle w:val="BodyText"/>
+      </w:pPr>
+      <w:r>
+        <w:t xml:space="preserve">Figura 3: Portal web intranet de IIS</w:t>
+      </w:r>
+      <w:r>
+        <w:t xml:space="preserve"> </w:t>
+      </w:r>
+      <w:r>
+        <w:t xml:space="preserve">“Segundo Parcial Alan”</w:t>
+      </w:r>
+      <w:r>
+        <w:t xml:space="preserve"> </w:t>
+      </w:r>
+      <w:r>
+        <w:t xml:space="preserve">cargado en el Windows Client.</w:t>
+      </w:r>
+    </w:p>
+    <w:bookmarkEnd w:id="22"/>
+    <w:bookmarkStart w:id="29" w:name="network-policy-server-nps-y-aaa-radius"/>
+    <w:p>
+      <w:pPr>
+        <w:pStyle w:val="Heading3"/>
+        <w:keepNext/>
+        <w:keepLines/>
+      </w:pPr>
+      <w:r>
+        <w:t xml:space="preserve">3.3 Network Policy Server (NPS) y AAA RADIUS</w:t>
+      </w:r>
+    </w:p>
+    <w:p>
+      <w:pPr>
+        <w:pStyle w:val="FirstParagraph"/>
+      </w:pPr>
+      <w:r>
+        <w:t xml:space="preserve">El servicio NPS gestiona las solicitudes de acceso SSH provenientes de los routers. El flujo de configuración requiere:</w:t>
       </w:r>
     </w:p>
     <w:p>
@@ -1710,6 +1826,411 @@
           <w:ilvl w:val="0"/>
           <w:numId w:val="1004"/>
         </w:numPr>
+        <w:keepNext/>
+        <w:keepLines/>
+      </w:pPr>
+      <w:r>
+        <w:rPr>
+          <w:b/>
+          <w:bCs/>
+        </w:rPr>
+        <w:t xml:space="preserve">Clientes RADIUS:</w:t>
+      </w:r>
+      <w:r>
+        <w:t xml:space="preserve"> </w:t>
+      </w:r>
+      <w:r>
+        <w:t xml:space="preserve">Se registran los routers</w:t>
+      </w:r>
+      <w:r>
+        <w:t xml:space="preserve"> </w:t>
+      </w:r>
+      <w:r>
+        <w:rPr>
+          <w:rStyle w:val="VerbatimChar"/>
+        </w:rPr>
+        <w:t xml:space="preserve">R-Oeste</w:t>
+      </w:r>
+      <w:r>
+        <w:t xml:space="preserve"> </w:t>
+      </w:r>
+      <w:r>
+        <w:t xml:space="preserve">(identificado en la red interna con su IP origen de túnel</w:t>
+      </w:r>
+      <w:r>
+        <w:t xml:space="preserve"> </w:t>
+      </w:r>
+      <w:r>
+        <w:rPr>
+          <w:rStyle w:val="VerbatimChar"/>
+        </w:rPr>
+        <w:t xml:space="preserve">10.0.0.1</w:t>
+      </w:r>
+      <w:r>
+        <w:t xml:space="preserve">) y</w:t>
+      </w:r>
+      <w:r>
+        <w:t xml:space="preserve"> </w:t>
+      </w:r>
+      <w:r>
+        <w:rPr>
+          <w:rStyle w:val="VerbatimChar"/>
+        </w:rPr>
+        <w:t xml:space="preserve">R-Este</w:t>
+      </w:r>
+      <w:r>
+        <w:t xml:space="preserve"> </w:t>
+      </w:r>
+      <w:r>
+        <w:t xml:space="preserve">(</w:t>
+      </w:r>
+      <w:r>
+        <w:rPr>
+          <w:rStyle w:val="VerbatimChar"/>
+        </w:rPr>
+        <w:t xml:space="preserve">14.3.20.1</w:t>
+      </w:r>
+      <w:r>
+        <w:t xml:space="preserve">) como clientes RADIUS de confianza. Se establece la clave secreta compartida:</w:t>
+      </w:r>
+      <w:r>
+        <w:t xml:space="preserve"> </w:t>
+      </w:r>
+      <w:r>
+        <w:rPr>
+          <w:rStyle w:val="VerbatimChar"/>
+        </w:rPr>
+        <w:t xml:space="preserve">20251403</w:t>
+      </w:r>
+      <w:r>
+        <w:t xml:space="preserve">.</w:t>
+      </w:r>
+      <w:r>
+        <w:t xml:space="preserve"> </w:t>
+      </w:r>
+      <w:r>
+        <w:drawing>
+          <wp:inline>
+            <wp:extent cx="5334000" cy="1757484"/>
+            <wp:effectExtent b="0" l="0" r="0" t="0"/>
+            <wp:docPr descr="RADIUS Clients en NPS" title="" id="24" name="Picture"/>
+            <ns2:graphic>
+              <ns2:graphicData uri="http://schemas.openxmlformats.org/drawingml/2006/picture">
+                <ns3:pic>
+                  <ns3:nvPicPr>
+                    <ns3:cNvPr descr="images/08_nps_radius_clients.png" id="25" name="Picture"/>
+                    <ns3:cNvPicPr>
+                      <ns2:picLocks noChangeArrowheads="1" noChangeAspect="1"/>
+                    </ns3:cNvPicPr>
+                  </ns3:nvPicPr>
+                  <ns3:blipFill>
+                    <ns2:blip r:embed="rId23"/>
+                    <ns2:stretch>
+                      <ns2:fillRect/>
+                    </ns2:stretch>
+                  </ns3:blipFill>
+                  <ns3:spPr bwMode="auto">
+                    <ns2:xfrm>
+                      <ns2:off x="0" y="0"/>
+                      <ns2:ext cx="5334000" cy="1757484"/>
+                    </ns2:xfrm>
+                    <ns2:prstGeom prst="rect">
+                      <ns2:avLst/>
+                    </ns2:prstGeom>
+                    <ns2:noFill/>
+                    <ns2:ln w="9525">
+                      <ns2:noFill/>
+                      <ns2:headEnd/>
+                      <ns2:tailEnd/>
+                    </ns2:ln>
+                  </ns3:spPr>
+                </ns3:pic>
+              </ns2:graphicData>
+            </ns2:graphic>
+          </wp:inline>
+        </w:drawing>
+      </w:r>
+    </w:p>
+    <w:p>
+      <w:pPr>
+        <w:pStyle w:val="Compact"/>
+        <w:numPr>
+          <w:ilvl w:val="0"/>
+          <w:numId w:val="1000"/>
+        </w:numPr>
+      </w:pPr>
+      <w:r>
+        <w:t xml:space="preserve">Figura 4: Clientes RADIUS registrados en el NPS para R-Oeste (10.0.0.1) y R-Este (14.3.20.1).</w:t>
+      </w:r>
+    </w:p>
+    <w:p>
+      <w:pPr>
+        <w:pStyle w:val="Compact"/>
+        <w:numPr>
+          <w:ilvl w:val="0"/>
+          <w:numId w:val="1004"/>
+        </w:numPr>
+      </w:pPr>
+      <w:r>
+        <w:rPr>
+          <w:b/>
+          <w:bCs/>
+        </w:rPr>
+        <w:t xml:space="preserve">Políticas de Red (Network Policies):</w:t>
+      </w:r>
+      <w:r>
+        <w:t xml:space="preserve"> </w:t>
+      </w:r>
+      <w:r>
+        <w:t xml:space="preserve">Se configuran tres políticas de acceso independientes con el siguiente orden de evaluación y condiciones:</w:t>
+      </w:r>
+    </w:p>
+    <w:p>
+      <w:pPr>
+        <w:pStyle w:val="Compact"/>
+        <w:numPr>
+          <w:ilvl w:val="1"/>
+          <w:numId w:val="1005"/>
+        </w:numPr>
+      </w:pPr>
+      <w:r>
+        <w:rPr>
+          <w:b/>
+          <w:bCs/>
+        </w:rPr>
+        <w:t xml:space="preserve">Cisco SSH Level 1 (Prioridad 1):</w:t>
+      </w:r>
+      <w:r>
+        <w:t xml:space="preserve"> </w:t>
+      </w:r>
+      <w:r>
+        <w:t xml:space="preserve">Evalúa la membresía en el grupo</w:t>
+      </w:r>
+      <w:r>
+        <w:t xml:space="preserve"> </w:t>
+      </w:r>
+      <w:r>
+        <w:rPr>
+          <w:rStyle w:val="VerbatimChar"/>
+        </w:rPr>
+        <w:t xml:space="preserve">ALAN\NPS1</w:t>
+      </w:r>
+      <w:r>
+        <w:t xml:space="preserve">. En los atributos de respuesta del RADIUS (pestaña Settings -&gt; Vendor Specific Attributes) se inyecta el Vendor Code</w:t>
+      </w:r>
+      <w:r>
+        <w:t xml:space="preserve"> </w:t>
+      </w:r>
+      <w:r>
+        <w:rPr>
+          <w:rStyle w:val="VerbatimChar"/>
+        </w:rPr>
+        <w:t xml:space="preserve">9</w:t>
+      </w:r>
+      <w:r>
+        <w:t xml:space="preserve"> </w:t>
+      </w:r>
+      <w:r>
+        <w:t xml:space="preserve">(Cisco) con el VSA</w:t>
+      </w:r>
+      <w:r>
+        <w:t xml:space="preserve"> </w:t>
+      </w:r>
+      <w:r>
+        <w:rPr>
+          <w:rStyle w:val="VerbatimChar"/>
+          <w:b/>
+          <w:bCs/>
+        </w:rPr>
+        <w:t xml:space="preserve">shell:priv-lvl=1</w:t>
+      </w:r>
+      <w:r>
+        <w:t xml:space="preserve">.</w:t>
+      </w:r>
+    </w:p>
+    <w:p>
+      <w:pPr>
+        <w:pStyle w:val="Compact"/>
+        <w:numPr>
+          <w:ilvl w:val="1"/>
+          <w:numId w:val="1005"/>
+        </w:numPr>
+      </w:pPr>
+      <w:r>
+        <w:rPr>
+          <w:b/>
+          <w:bCs/>
+        </w:rPr>
+        <w:t xml:space="preserve">Cisco SSH Level 10 (Prioridad 2):</w:t>
+      </w:r>
+      <w:r>
+        <w:t xml:space="preserve"> </w:t>
+      </w:r>
+      <w:r>
+        <w:t xml:space="preserve">Evalúa la membresía en el grupo</w:t>
+      </w:r>
+      <w:r>
+        <w:t xml:space="preserve"> </w:t>
+      </w:r>
+      <w:r>
+        <w:rPr>
+          <w:rStyle w:val="VerbatimChar"/>
+        </w:rPr>
+        <w:t xml:space="preserve">ALAN\NPS10</w:t>
+      </w:r>
+      <w:r>
+        <w:t xml:space="preserve">. Inyecta el atributo Cisco-AV-Pair</w:t>
+      </w:r>
+      <w:r>
+        <w:t xml:space="preserve"> </w:t>
+      </w:r>
+      <w:r>
+        <w:rPr>
+          <w:rStyle w:val="VerbatimChar"/>
+          <w:b/>
+          <w:bCs/>
+        </w:rPr>
+        <w:t xml:space="preserve">shell:priv-lvl=10</w:t>
+      </w:r>
+      <w:r>
+        <w:t xml:space="preserve">.</w:t>
+      </w:r>
+    </w:p>
+    <w:p>
+      <w:pPr>
+        <w:pStyle w:val="Compact"/>
+        <w:numPr>
+          <w:ilvl w:val="1"/>
+          <w:numId w:val="1005"/>
+        </w:numPr>
+        <w:keepNext/>
+        <w:keepLines/>
+      </w:pPr>
+      <w:r>
+        <w:rPr>
+          <w:b/>
+          <w:bCs/>
+        </w:rPr>
+        <w:t xml:space="preserve">Cisco SSH Level 15 (Prioridad 3):</w:t>
+      </w:r>
+      <w:r>
+        <w:t xml:space="preserve"> </w:t>
+      </w:r>
+      <w:r>
+        <w:t xml:space="preserve">Evalúa la membresía en el grupo</w:t>
+      </w:r>
+      <w:r>
+        <w:t xml:space="preserve"> </w:t>
+      </w:r>
+      <w:r>
+        <w:rPr>
+          <w:rStyle w:val="VerbatimChar"/>
+        </w:rPr>
+        <w:t xml:space="preserve">ALAN\NPS15</w:t>
+      </w:r>
+      <w:r>
+        <w:t xml:space="preserve">. Inyecta el atributo Cisco-AV-Pair</w:t>
+      </w:r>
+      <w:r>
+        <w:t xml:space="preserve"> </w:t>
+      </w:r>
+      <w:r>
+        <w:rPr>
+          <w:rStyle w:val="VerbatimChar"/>
+          <w:b/>
+          <w:bCs/>
+        </w:rPr>
+        <w:t xml:space="preserve">shell:priv-lvl=15</w:t>
+      </w:r>
+      <w:r>
+        <w:t xml:space="preserve">.</w:t>
+      </w:r>
+      <w:r>
+        <w:t xml:space="preserve"> </w:t>
+      </w:r>
+      <w:r>
+        <w:drawing>
+          <wp:inline>
+            <wp:extent cx="5334000" cy="1793915"/>
+            <wp:effectExtent b="0" l="0" r="0" t="0"/>
+            <wp:docPr descr="Network Policies en NPS" title="" id="27" name="Picture"/>
+            <ns2:graphic>
+              <ns2:graphicData uri="http://schemas.openxmlformats.org/drawingml/2006/picture">
+                <ns3:pic>
+                  <ns3:nvPicPr>
+                    <ns3:cNvPr descr="images/07_nps_network_policies.png" id="28" name="Picture"/>
+                    <ns3:cNvPicPr>
+                      <ns2:picLocks noChangeArrowheads="1" noChangeAspect="1"/>
+                    </ns3:cNvPicPr>
+                  </ns3:nvPicPr>
+                  <ns3:blipFill>
+                    <ns2:blip r:embed="rId26"/>
+                    <ns2:stretch>
+                      <ns2:fillRect/>
+                    </ns2:stretch>
+                  </ns3:blipFill>
+                  <ns3:spPr bwMode="auto">
+                    <ns2:xfrm>
+                      <ns2:off x="0" y="0"/>
+                      <ns2:ext cx="5334000" cy="1793915"/>
+                    </ns2:xfrm>
+                    <ns2:prstGeom prst="rect">
+                      <ns2:avLst/>
+                    </ns2:prstGeom>
+                    <ns2:noFill/>
+                    <ns2:ln w="9525">
+                      <ns2:noFill/>
+                      <ns2:headEnd/>
+                      <ns2:tailEnd/>
+                    </ns2:ln>
+                  </ns3:spPr>
+                </ns3:pic>
+              </ns2:graphicData>
+            </ns2:graphic>
+          </wp:inline>
+        </w:drawing>
+      </w:r>
+    </w:p>
+    <w:p>
+      <w:pPr>
+        <w:pStyle w:val="Compact"/>
+        <w:numPr>
+          <w:ilvl w:val="1"/>
+          <w:numId w:val="1000"/>
+        </w:numPr>
+      </w:pPr>
+      <w:r>
+        <w:t xml:space="preserve">Figura 5: Directivas de red (Network Policies) estructuradas en el NPS según el nivel de privilegio.</w:t>
+      </w:r>
+    </w:p>
+    <w:bookmarkEnd w:id="29"/>
+    <w:bookmarkEnd w:id="30"/>
+    <w:bookmarkStart w:id="35" w:name="X2c3b685f59dfbcf278e5fb345c3177493ad1345"/>
+    <w:p>
+      <w:pPr>
+        <w:pStyle w:val="Heading2"/>
+        <w:keepNext/>
+        <w:keepLines/>
+      </w:pPr>
+      <w:r>
+        <w:t xml:space="preserve">4. Configuración de Dispositivos Cisco (Cisco IOS)</w:t>
+      </w:r>
+    </w:p>
+    <w:p>
+      <w:pPr>
+        <w:pStyle w:val="FirstParagraph"/>
+      </w:pPr>
+      <w:r>
+        <w:t xml:space="preserve">Todos los comandos y configuraciones completas aplicados a los routers se encuentran estructurados y comentados de forma organizada en los siguientes recursos del repositorio:</w:t>
+      </w:r>
+    </w:p>
+    <w:p>
+      <w:pPr>
+        <w:pStyle w:val="Compact"/>
+        <w:numPr>
+          <w:ilvl w:val="0"/>
+          <w:numId w:val="1006"/>
+        </w:numPr>
       </w:pPr>
       <w:r>
         <w:t xml:space="preserve">Script de Configuración del Router Oeste:</w:t>
@@ -1717,7 +2238,7 @@
       <w:r>
         <w:t xml:space="preserve"> </w:t>
       </w:r>
-      <w:hyperlink r:id="rId19">
+      <w:hyperlink r:id="rId31">
         <w:r>
           <w:rPr>
             <w:rStyle w:val="Hyperlink"/>
@@ -1734,7 +2255,7 @@
         <w:pStyle w:val="Compact"/>
         <w:numPr>
           <w:ilvl w:val="0"/>
-          <w:numId w:val="1004"/>
+          <w:numId w:val="1006"/>
         </w:numPr>
       </w:pPr>
       <w:r>
@@ -1743,7 +2264,7 @@
       <w:r>
         <w:t xml:space="preserve"> </w:t>
       </w:r>
-      <w:hyperlink r:id="rId20">
+      <w:hyperlink r:id="rId32">
         <w:r>
           <w:rPr>
             <w:rStyle w:val="Hyperlink"/>
@@ -1760,7 +2281,7 @@
         <w:pStyle w:val="Compact"/>
         <w:numPr>
           <w:ilvl w:val="0"/>
-          <w:numId w:val="1004"/>
+          <w:numId w:val="1006"/>
         </w:numPr>
       </w:pPr>
       <w:r>
@@ -1769,7 +2290,7 @@
       <w:r>
         <w:t xml:space="preserve"> </w:t>
       </w:r>
-      <w:hyperlink r:id="rId21">
+      <w:hyperlink r:id="rId33">
         <w:r>
           <w:rPr>
             <w:rStyle w:val="Hyperlink"/>
@@ -1781,7 +2302,7 @@
         <w:t xml:space="preserve">.</w:t>
       </w:r>
     </w:p>
-    <w:bookmarkStart w:id="22" w:name="X0834915414cc4d95cdc48ca7fbeb6c8b11e633d"/>
+    <w:bookmarkStart w:id="34" w:name="X0834915414cc4d95cdc48ca7fbeb6c8b11e633d"/>
     <w:p>
       <w:pPr>
         <w:pStyle w:val="Heading3"/>
@@ -1805,7 +2326,7 @@
         <w:pStyle w:val="Compact"/>
         <w:numPr>
           <w:ilvl w:val="0"/>
-          <w:numId w:val="1005"/>
+          <w:numId w:val="1007"/>
         </w:numPr>
       </w:pPr>
       <w:r>
@@ -1857,7 +2378,7 @@
         <w:pStyle w:val="Compact"/>
         <w:numPr>
           <w:ilvl w:val="0"/>
-          <w:numId w:val="1005"/>
+          <w:numId w:val="1007"/>
         </w:numPr>
       </w:pPr>
       <w:r>
@@ -1879,7 +2400,7 @@
         <w:pStyle w:val="Compact"/>
         <w:numPr>
           <w:ilvl w:val="0"/>
-          <w:numId w:val="1005"/>
+          <w:numId w:val="1007"/>
         </w:numPr>
       </w:pPr>
       <w:r>
@@ -1935,9 +2456,9 @@
         <w:t xml:space="preserve">. El resto de tránsitos (ej. RDP puerto 3389, SMB puerto 445) provenientes de la LAN remota Oeste son denegados por completo.</w:t>
       </w:r>
     </w:p>
-    <w:bookmarkEnd w:id="22"/>
-    <w:bookmarkEnd w:id="23"/>
-    <w:bookmarkStart w:id="29" w:name="implementación-de-la-vpn-site-to-site"/>
+    <w:bookmarkEnd w:id="34"/>
+    <w:bookmarkEnd w:id="35"/>
+    <w:bookmarkStart w:id="41" w:name="implementación-de-la-vpn-site-to-site"/>
     <w:p>
       <w:pPr>
         <w:pStyle w:val="Heading2"/>
@@ -1956,7 +2477,7 @@
         <w:t xml:space="preserve">La interconexión segura entre la LAN Oeste y la LAN Este se realiza implementando un túnel GRE protegido por IPSec mediante políticas ISAKMP tradicionales en IKEv1:</w:t>
       </w:r>
     </w:p>
-    <w:bookmarkStart w:id="24" w:name="parámetros-isakmp-de-fase-1"/>
+    <w:bookmarkStart w:id="36" w:name="parámetros-isakmp-de-fase-1"/>
     <w:p>
       <w:pPr>
         <w:pStyle w:val="Heading3"/>
@@ -1980,7 +2501,7 @@
         <w:pStyle w:val="Compact"/>
         <w:numPr>
           <w:ilvl w:val="0"/>
-          <w:numId w:val="1006"/>
+          <w:numId w:val="1008"/>
         </w:numPr>
       </w:pPr>
       <w:r>
@@ -2002,7 +2523,7 @@
         <w:pStyle w:val="Compact"/>
         <w:numPr>
           <w:ilvl w:val="0"/>
-          <w:numId w:val="1006"/>
+          <w:numId w:val="1008"/>
         </w:numPr>
       </w:pPr>
       <w:r>
@@ -2024,7 +2545,7 @@
         <w:pStyle w:val="Compact"/>
         <w:numPr>
           <w:ilvl w:val="0"/>
-          <w:numId w:val="1006"/>
+          <w:numId w:val="1008"/>
         </w:numPr>
       </w:pPr>
       <w:r>
@@ -2046,7 +2567,7 @@
         <w:pStyle w:val="Compact"/>
         <w:numPr>
           <w:ilvl w:val="0"/>
-          <w:numId w:val="1006"/>
+          <w:numId w:val="1008"/>
         </w:numPr>
       </w:pPr>
       <w:r>
@@ -2068,7 +2589,7 @@
         <w:pStyle w:val="Compact"/>
         <w:numPr>
           <w:ilvl w:val="0"/>
-          <w:numId w:val="1006"/>
+          <w:numId w:val="1008"/>
         </w:numPr>
       </w:pPr>
       <w:r>
@@ -2097,8 +2618,8 @@
         <w:t xml:space="preserve">.</w:t>
       </w:r>
     </w:p>
-    <w:bookmarkEnd w:id="24"/>
-    <w:bookmarkStart w:id="28" w:name="parámetros-ipsec-de-fase-2"/>
+    <w:bookmarkEnd w:id="36"/>
+    <w:bookmarkStart w:id="40" w:name="parámetros-ipsec-de-fase-2"/>
     <w:p>
       <w:pPr>
         <w:pStyle w:val="Heading3"/>
@@ -2205,18 +2726,18 @@
           <wp:inline>
             <wp:extent cx="5334000" cy="1562400"/>
             <wp:effectExtent b="0" l="0" r="0" t="0"/>
-            <wp:docPr descr="Crypto Session Active" title="" id="26" name="Picture"/>
+            <wp:docPr descr="Crypto Session Active" title="" id="38" name="Picture"/>
             <ns2:graphic>
               <ns2:graphicData uri="http://schemas.openxmlformats.org/drawingml/2006/picture">
                 <ns3:pic>
                   <ns3:nvPicPr>
-                    <ns3:cNvPr descr="images/05_crypto_session_active.png" id="27" name="Picture"/>
+                    <ns3:cNvPr descr="images/05_crypto_session_active.png" id="39" name="Picture"/>
                     <ns3:cNvPicPr>
                       <ns2:picLocks noChangeArrowheads="1" noChangeAspect="1"/>
                     </ns3:cNvPicPr>
                   </ns3:nvPicPr>
                   <ns3:blipFill>
-                    <ns2:blip r:embed="rId25"/>
+                    <ns2:blip r:embed="rId37"/>
                     <ns2:stretch>
                       <ns2:fillRect/>
                     </ns2:stretch>
@@ -2259,9 +2780,9 @@
         <w:t xml:space="preserve">Figura 6: Verificación del estado activo (ACTIVE) del túnel VPN IKEv1 (ISAKMP) en R-Oeste.</w:t>
       </w:r>
     </w:p>
-    <w:bookmarkEnd w:id="28"/>
-    <w:bookmarkEnd w:id="29"/>
-    <w:bookmarkStart w:id="33" w:name="Xc0b4b065515739d96369c9eb0cbe92e6b310c73"/>
+    <w:bookmarkEnd w:id="40"/>
+    <w:bookmarkEnd w:id="41"/>
+    <w:bookmarkStart w:id="48" w:name="Xc0b4b065515739d96369c9eb0cbe92e6b310c73"/>
     <w:p>
       <w:pPr>
         <w:pStyle w:val="Heading2"/>
@@ -2285,7 +2806,7 @@
         <w:pStyle w:val="Compact"/>
         <w:numPr>
           <w:ilvl w:val="0"/>
-          <w:numId w:val="1007"/>
+          <w:numId w:val="1009"/>
         </w:numPr>
       </w:pPr>
       <w:r>
@@ -2352,8 +2873,10 @@
         <w:pStyle w:val="Compact"/>
         <w:numPr>
           <w:ilvl w:val="0"/>
-          <w:numId w:val="1007"/>
+          <w:numId w:val="1009"/>
         </w:numPr>
+        <w:keepNext/>
+        <w:keepLines/>
       </w:pPr>
       <w:r>
         <w:rPr>
@@ -2410,30 +2933,23 @@
       <w:r>
         <w:t xml:space="preserve"> </w:t>
       </w:r>
-    </w:p>
-    <w:p>
-      <w:pPr>
-        <w:pStyle w:val="CaptionedFigure"/>
-        <w:keepNext/>
-        <w:keepLines/>
-      </w:pPr>
       <w:r>
         <w:drawing>
           <wp:inline>
             <wp:extent cx="5334000" cy="1821365"/>
             <wp:effectExtent b="0" l="0" r="0" t="0"/>
-            <wp:docPr descr="Tracert VPN" title="" id="31" name="Picture"/>
+            <wp:docPr descr="Tracert VPN" title="" id="43" name="Picture"/>
             <ns2:graphic>
               <ns2:graphicData uri="http://schemas.openxmlformats.org/drawingml/2006/picture">
                 <ns3:pic>
                   <ns3:nvPicPr>
-                    <ns3:cNvPr descr="images/03_tracert_vpn.png" id="32" name="Picture"/>
+                    <ns3:cNvPr descr="images/03_tracert_vpn.png" id="44" name="Picture"/>
                     <ns3:cNvPicPr>
                       <ns2:picLocks noChangeArrowheads="1" noChangeAspect="1"/>
                     </ns3:cNvPicPr>
                   </ns3:nvPicPr>
                   <ns3:blipFill>
-                    <ns2:blip r:embed="rId30"/>
+                    <ns2:blip r:embed="rId42"/>
                     <ns2:stretch>
                       <ns2:fillRect/>
                     </ns2:stretch>
@@ -2462,25 +2978,281 @@
     </w:p>
     <w:p>
       <w:pPr>
-        <w:pStyle w:val="ImageCaption"/>
-      </w:pPr>
-      <w:r>
-        <w:t xml:space="preserve">Tracert VPN</w:t>
-      </w:r>
-    </w:p>
-    <w:p>
-      <w:pPr>
-        <w:pStyle w:val="BodyText"/>
-      </w:pPr>
-      <w:r>
-        <w:rPr>
-          <w:i/>
-          <w:iCs/>
-        </w:rPr>
+        <w:pStyle w:val="Compact"/>
+        <w:numPr>
+          <w:ilvl w:val="0"/>
+          <w:numId w:val="1000"/>
+        </w:numPr>
+      </w:pPr>
+      <w:r>
         <w:t xml:space="preserve">Figura 7: Ejecución de tracert verificando que el tráfico LAN a LAN pasa a través del túnel VPN (10.0.0.2).</w:t>
       </w:r>
     </w:p>
-    <w:bookmarkEnd w:id="33"/>
+    <w:p>
+      <w:pPr>
+        <w:pStyle w:val="Compact"/>
+        <w:numPr>
+          <w:ilvl w:val="0"/>
+          <w:numId w:val="1009"/>
+        </w:numPr>
+      </w:pPr>
+      <w:r>
+        <w:rPr>
+          <w:b/>
+          <w:bCs/>
+        </w:rPr>
+        <w:t xml:space="preserve">Acceso Web a la Intranet IIS:</w:t>
+      </w:r>
+      <w:r>
+        <w:t xml:space="preserve"> </w:t>
+      </w:r>
+      <w:r>
+        <w:t xml:space="preserve">Abrir el navegador web (Edge/Firefox) en el Windows Client y acceder a la dirección</w:t>
+      </w:r>
+      <w:r>
+        <w:t xml:space="preserve"> </w:t>
+      </w:r>
+      <w:r>
+        <w:rPr>
+          <w:rStyle w:val="VerbatimChar"/>
+        </w:rPr>
+        <w:t xml:space="preserve">http://14.3.20.2</w:t>
+      </w:r>
+      <w:r>
+        <w:t xml:space="preserve">. Se debe cargar el portal corporativo de intranet mostrando el título</w:t>
+      </w:r>
+      <w:r>
+        <w:t xml:space="preserve"> </w:t>
+      </w:r>
+      <w:r>
+        <w:t xml:space="preserve">“Segundo Parcial Alan”</w:t>
+      </w:r>
+      <w:r>
+        <w:t xml:space="preserve"> </w:t>
+      </w:r>
+      <w:r>
+        <w:t xml:space="preserve">y tu matrícula.</w:t>
+      </w:r>
+    </w:p>
+    <w:p>
+      <w:pPr>
+        <w:pStyle w:val="Compact"/>
+        <w:numPr>
+          <w:ilvl w:val="0"/>
+          <w:numId w:val="1009"/>
+        </w:numPr>
+      </w:pPr>
+      <w:r>
+        <w:rPr>
+          <w:b/>
+          <w:bCs/>
+        </w:rPr>
+        <w:t xml:space="preserve">Verificación de Direccionamiento en Windows Client:</w:t>
+      </w:r>
+      <w:r>
+        <w:t xml:space="preserve"> </w:t>
+      </w:r>
+      <w:r>
+        <w:t xml:space="preserve">Ejecutar</w:t>
+      </w:r>
+      <w:r>
+        <w:t xml:space="preserve"> </w:t>
+      </w:r>
+      <w:r>
+        <w:rPr>
+          <w:rStyle w:val="VerbatimChar"/>
+        </w:rPr>
+        <w:t xml:space="preserve">ipconfig /all</w:t>
+      </w:r>
+      <w:r>
+        <w:t xml:space="preserve"> </w:t>
+      </w:r>
+      <w:r>
+        <w:t xml:space="preserve">en el Windows Client para validar que obtiene direccionamiento dinámico dentro del segmento de matrícula asignado por el servidor DHCP de R-Oeste.</w:t>
+      </w:r>
+    </w:p>
+    <w:p>
+      <w:pPr>
+        <w:pStyle w:val="Compact"/>
+        <w:numPr>
+          <w:ilvl w:val="0"/>
+          <w:numId w:val="1009"/>
+        </w:numPr>
+      </w:pPr>
+      <w:r>
+        <w:rPr>
+          <w:b/>
+          <w:bCs/>
+        </w:rPr>
+        <w:t xml:space="preserve">Verificación de Funcionamiento de la ACL:</w:t>
+      </w:r>
+      <w:r>
+        <w:t xml:space="preserve"> </w:t>
+      </w:r>
+      <w:r>
+        <w:t xml:space="preserve">Realizar una prueba de conectividad desde el cliente usando ping (</w:t>
+      </w:r>
+      <w:r>
+        <w:rPr>
+          <w:rStyle w:val="VerbatimChar"/>
+        </w:rPr>
+        <w:t xml:space="preserve">ping 14.3.20.2</w:t>
+      </w:r>
+      <w:r>
+        <w:t xml:space="preserve">) y verificar que responde correctamente. Posteriormente, intentar establecer una conexión remota RDP (</w:t>
+      </w:r>
+      <w:r>
+        <w:rPr>
+          <w:rStyle w:val="VerbatimChar"/>
+        </w:rPr>
+        <w:t xml:space="preserve">mstsc</w:t>
+      </w:r>
+      <w:r>
+        <w:t xml:space="preserve">) o transferencia de archivos hacia el servidor para evidenciar que el tráfico es bloqueado por la ACL en el router.</w:t>
+      </w:r>
+    </w:p>
+    <w:p>
+      <w:pPr>
+        <w:pStyle w:val="Compact"/>
+        <w:numPr>
+          <w:ilvl w:val="0"/>
+          <w:numId w:val="1009"/>
+        </w:numPr>
+      </w:pPr>
+      <w:r>
+        <w:rPr>
+          <w:b/>
+          <w:bCs/>
+        </w:rPr>
+        <w:t xml:space="preserve">Autenticación en Equipos con 3 Usuarios de AD:</w:t>
+      </w:r>
+      <w:r>
+        <w:t xml:space="preserve"> </w:t>
+      </w:r>
+      <w:r>
+        <w:t xml:space="preserve">Iniciar sesión por SSH desde un cliente hacia los routers utilizando las credenciales de AD configuradas:</w:t>
+      </w:r>
+    </w:p>
+    <w:p>
+      <w:pPr>
+        <w:pStyle w:val="Compact"/>
+        <w:numPr>
+          <w:ilvl w:val="1"/>
+          <w:numId w:val="1010"/>
+        </w:numPr>
+        <w:keepNext/>
+        <w:keepLines/>
+      </w:pPr>
+      <w:r>
+        <w:t xml:space="preserve">Iniciar sesión con el usuario de nivel 15 (</w:t>
+      </w:r>
+      <w:r>
+        <w:rPr>
+          <w:rStyle w:val="VerbatimChar"/>
+        </w:rPr>
+        <w:t xml:space="preserve">USR15</w:t>
+      </w:r>
+      <w:r>
+        <w:t xml:space="preserve">) y ejecutar</w:t>
+      </w:r>
+      <w:r>
+        <w:t xml:space="preserve"> </w:t>
+      </w:r>
+      <w:r>
+        <w:rPr>
+          <w:rStyle w:val="VerbatimChar"/>
+        </w:rPr>
+        <w:t xml:space="preserve">show privilege</w:t>
+      </w:r>
+      <w:r>
+        <w:t xml:space="preserve"> </w:t>
+      </w:r>
+      <w:r>
+        <w:t xml:space="preserve">para demostrar que se entra directamente en modo de configuración de nivel 15.</w:t>
+      </w:r>
+      <w:r>
+        <w:t xml:space="preserve"> </w:t>
+      </w:r>
+      <w:r>
+        <w:drawing>
+          <wp:inline>
+            <wp:extent cx="5334000" cy="1439746"/>
+            <wp:effectExtent b="0" l="0" r="0" t="0"/>
+            <wp:docPr descr="Autenticacion SSH RADIUS" title="" id="46" name="Picture"/>
+            <ns2:graphic>
+              <ns2:graphicData uri="http://schemas.openxmlformats.org/drawingml/2006/picture">
+                <ns3:pic>
+                  <ns3:nvPicPr>
+                    <ns3:cNvPr descr="images/04_ssh_radius_autenticacion.png" id="47" name="Picture"/>
+                    <ns3:cNvPicPr>
+                      <ns2:picLocks noChangeArrowheads="1" noChangeAspect="1"/>
+                    </ns3:cNvPicPr>
+                  </ns3:nvPicPr>
+                  <ns3:blipFill>
+                    <ns2:blip r:embed="rId45"/>
+                    <ns2:stretch>
+                      <ns2:fillRect/>
+                    </ns2:stretch>
+                  </ns3:blipFill>
+                  <ns3:spPr bwMode="auto">
+                    <ns2:xfrm>
+                      <ns2:off x="0" y="0"/>
+                      <ns2:ext cx="5334000" cy="1439746"/>
+                    </ns2:xfrm>
+                    <ns2:prstGeom prst="rect">
+                      <ns2:avLst/>
+                    </ns2:prstGeom>
+                    <ns2:noFill/>
+                    <ns2:ln w="9525">
+                      <ns2:noFill/>
+                      <ns2:headEnd/>
+                      <ns2:tailEnd/>
+                    </ns2:ln>
+                  </ns3:spPr>
+                </ns3:pic>
+              </ns2:graphicData>
+            </ns2:graphic>
+          </wp:inline>
+        </w:drawing>
+      </w:r>
+    </w:p>
+    <w:p>
+      <w:pPr>
+        <w:pStyle w:val="Compact"/>
+        <w:numPr>
+          <w:ilvl w:val="1"/>
+          <w:numId w:val="1000"/>
+        </w:numPr>
+      </w:pPr>
+      <w:r>
+        <w:t xml:space="preserve">Figura 8: Prueba de inicio de sesión SSH con USR15 y validación de privilegio de nivel 15.</w:t>
+      </w:r>
+    </w:p>
+    <w:p>
+      <w:pPr>
+        <w:pStyle w:val="Compact"/>
+        <w:numPr>
+          <w:ilvl w:val="1"/>
+          <w:numId w:val="1010"/>
+        </w:numPr>
+      </w:pPr>
+      <w:r>
+        <w:t xml:space="preserve">Iniciar sesión con el usuario de nivel 10 para comprobar que se asigna el nivel 10.</w:t>
+      </w:r>
+    </w:p>
+    <w:p>
+      <w:pPr>
+        <w:pStyle w:val="Compact"/>
+        <w:numPr>
+          <w:ilvl w:val="1"/>
+          <w:numId w:val="1010"/>
+        </w:numPr>
+      </w:pPr>
+      <w:r>
+        <w:t xml:space="preserve">Iniciar sesión con el usuario de nivel 1 para verificar que el nivel de acceso se restringe al mínimo.</w:t>
+      </w:r>
+    </w:p>
+    <w:bookmarkEnd w:id="48"/>
     <w:sectPr>
       <w:footnotePr>
         <w:numRestart w:val="eachSect"/>
@@ -2792,15 +3564,6 @@
     <w:abstractNumId w:val="991"/>
   </w:num>
   <w:num w:numId="1004">
-    <w:abstractNumId w:val="991"/>
-  </w:num>
-  <w:num w:numId="1005">
-    <w:abstractNumId w:val="991"/>
-  </w:num>
-  <w:num w:numId="1006">
-    <w:abstractNumId w:val="991"/>
-  </w:num>
-  <w:num w:numId="1007">
     <w:abstractNumId w:val="99411"/>
     <w:lvlOverride w:ilvl="0">
       <w:startOverride w:val="1"/>
@@ -2829,6 +3592,51 @@
     <w:lvlOverride w:ilvl="8">
       <w:startOverride w:val="1"/>
     </w:lvlOverride>
+  </w:num>
+  <w:num w:numId="1005">
+    <w:abstractNumId w:val="991"/>
+  </w:num>
+  <w:num w:numId="1006">
+    <w:abstractNumId w:val="991"/>
+  </w:num>
+  <w:num w:numId="1007">
+    <w:abstractNumId w:val="991"/>
+  </w:num>
+  <w:num w:numId="1008">
+    <w:abstractNumId w:val="991"/>
+  </w:num>
+  <w:num w:numId="1009">
+    <w:abstractNumId w:val="99411"/>
+    <w:lvlOverride w:ilvl="0">
+      <w:startOverride w:val="1"/>
+    </w:lvlOverride>
+    <w:lvlOverride w:ilvl="1">
+      <w:startOverride w:val="1"/>
+    </w:lvlOverride>
+    <w:lvlOverride w:ilvl="2">
+      <w:startOverride w:val="1"/>
+    </w:lvlOverride>
+    <w:lvlOverride w:ilvl="3">
+      <w:startOverride w:val="1"/>
+    </w:lvlOverride>
+    <w:lvlOverride w:ilvl="4">
+      <w:startOverride w:val="1"/>
+    </w:lvlOverride>
+    <w:lvlOverride w:ilvl="5">
+      <w:startOverride w:val="1"/>
+    </w:lvlOverride>
+    <w:lvlOverride w:ilvl="6">
+      <w:startOverride w:val="1"/>
+    </w:lvlOverride>
+    <w:lvlOverride w:ilvl="7">
+      <w:startOverride w:val="1"/>
+    </w:lvlOverride>
+    <w:lvlOverride w:ilvl="8">
+      <w:startOverride w:val="1"/>
+    </w:lvlOverride>
+  </w:num>
+  <w:num w:numId="1010">
+    <w:abstractNumId w:val="991"/>
   </w:num>
 </w:numbering>
 </file>

</xml_diff>

<commit_message>
Add GitHub repository link to presentation card on cover page
</commit_message>
<xml_diff>
--- a/AlanGarcia_2025-1403_Segundo_Parcial.docx
+++ b/AlanGarcia_2025-1403_Segundo_Parcial.docx
@@ -120,6 +120,18 @@
       </w:r>
       <w:r>
         <w:t xml:space="preserve">https://youtu.be/tIp-_Fub9n0</w:t>
+      </w:r>
+      <w:r>
+        <w:t xml:space="preserve"> </w:t>
+      </w:r>
+      <w:r>
+        <w:t xml:space="preserve">Enlace Repositorio:</w:t>
+      </w:r>
+      <w:r>
+        <w:t xml:space="preserve"> </w:t>
+      </w:r>
+      <w:r>
+        <w:t xml:space="preserve">https://github.com/imAlanG16/segundo-parcial-seguridad-de-redes</w:t>
       </w:r>
     </w:p>
     <w:bookmarkStart w:id="9" w:name="introducción-y-objetivos"/>

</xml_diff>